<commit_message>
Rebuild Capability Statement as a clean one-page letter layout.
Keep the original copy, fit everything on a single 8.5x11 page, and place
a working QR to axisbimsolutions.com in the footer next to contact details.
</commit_message>
<xml_diff>
--- a/Axis_BIM_Solutions_Capability_Statement.docx
+++ b/Axis_BIM_Solutions_Capability_Statement.docx
@@ -17,12 +17,12 @@
         <w:tblLayout w:type="fixed"/>
       </w:tblPr>
       <w:tblGrid>
-        <w:gridCol w:w="11088"/>
+        <w:gridCol w:w="11146"/>
       </w:tblGrid>
       <w:tr>
         <w:tc>
           <w:tcPr>
-            <w:tcW w:type="dxa" w:w="11088"/>
+            <w:tcW w:type="dxa" w:w="11146"/>
             <w:tcMar>
               <w:top w:w="0" w:type="dxa"/>
               <w:bottom w:w="0" w:type="dxa"/>
@@ -32,12 +32,12 @@
           </w:tcPr>
           <w:p>
             <w:pPr>
-              <w:spacing w:before="0" w:after="0" w:line="259" w:lineRule="auto"/>
+              <w:spacing w:before="0" w:after="0" w:line="252" w:lineRule="auto"/>
             </w:pPr>
             <w:r>
               <w:drawing>
                 <wp:inline xmlns:a="http://schemas.openxmlformats.org/drawingml/2006/main" xmlns:pic="http://schemas.openxmlformats.org/drawingml/2006/picture">
-                  <wp:extent cx="7040880" cy="1325880"/>
+                  <wp:extent cx="7077456" cy="1207008"/>
                   <wp:docPr id="1" name="Picture 1"/>
                   <wp:cNvGraphicFramePr>
                     <a:graphicFrameLocks noChangeAspect="1"/>
@@ -46,7 +46,7 @@
                     <a:graphicData uri="http://schemas.openxmlformats.org/drawingml/2006/picture">
                       <pic:pic>
                         <pic:nvPicPr>
-                          <pic:cNvPr id="0" name="capability_header_composite.png"/>
+                          <pic:cNvPr id="0" name="capability_header_from_docx.png"/>
                           <pic:cNvPicPr/>
                         </pic:nvPicPr>
                         <pic:blipFill>
@@ -58,7 +58,7 @@
                         <pic:spPr>
                           <a:xfrm>
                             <a:off x="0" y="0"/>
-                            <a:ext cx="7040880" cy="1325880"/>
+                            <a:ext cx="7077456" cy="1207008"/>
                           </a:xfrm>
                           <a:prstGeom prst="rect"/>
                         </pic:spPr>
@@ -74,7 +74,7 @@
     </w:tbl>
     <w:p>
       <w:pPr>
-        <w:spacing w:before="80" w:after="40" w:line="259" w:lineRule="auto"/>
+        <w:spacing w:before="60" w:after="40" w:line="252" w:lineRule="auto"/>
       </w:pPr>
     </w:p>
     <w:tbl>
@@ -92,17 +92,17 @@
         <w:tblLayout w:type="fixed"/>
       </w:tblPr>
       <w:tblGrid>
-        <w:gridCol w:w="4536"/>
-        <w:gridCol w:w="6552"/>
+        <w:gridCol w:w="4392"/>
+        <w:gridCol w:w="6754"/>
       </w:tblGrid>
       <w:tr>
         <w:tc>
           <w:tcPr>
-            <w:tcW w:type="dxa" w:w="5544"/>
+            <w:tcW w:type="dxa" w:w="5573"/>
             <w:shd w:fill="F5F0E1" w:val="clear"/>
             <w:tcMar>
-              <w:top w:w="80" w:type="dxa"/>
-              <w:bottom w:w="80" w:type="dxa"/>
+              <w:top w:w="70" w:type="dxa"/>
+              <w:bottom w:w="70" w:type="dxa"/>
               <w:left w:w="70" w:type="dxa"/>
               <w:right w:w="70" w:type="dxa"/>
             </w:tcMar>
@@ -123,30 +123,30 @@
               <w:tblLayout w:type="fixed"/>
             </w:tblPr>
             <w:tblGrid>
-              <w:gridCol w:w="5544"/>
+              <w:gridCol w:w="5573"/>
             </w:tblGrid>
             <w:tr>
               <w:tc>
                 <w:tcPr>
-                  <w:tcW w:type="dxa" w:w="5544"/>
+                  <w:tcW w:type="dxa" w:w="5573"/>
                   <w:shd w:fill="001F5C" w:val="clear"/>
                   <w:tcMar>
-                    <w:top w:w="40" w:type="dxa"/>
-                    <w:bottom w:w="40" w:type="dxa"/>
-                    <w:left w:w="80" w:type="dxa"/>
-                    <w:right w:w="80" w:type="dxa"/>
+                    <w:top w:w="30" w:type="dxa"/>
+                    <w:bottom w:w="30" w:type="dxa"/>
+                    <w:left w:w="70" w:type="dxa"/>
+                    <w:right w:w="70" w:type="dxa"/>
                   </w:tcMar>
                 </w:tcPr>
                 <w:p>
                   <w:pPr>
-                    <w:spacing w:before="0" w:after="0" w:line="259" w:lineRule="auto"/>
+                    <w:spacing w:before="0" w:after="0" w:line="252" w:lineRule="auto"/>
                   </w:pPr>
                   <w:r>
                     <w:rPr>
                       <w:rFonts w:ascii="Calibri" w:hAnsi="Calibri" w:eastAsia="Calibri"/>
                       <w:b/>
                       <w:color w:val="FFFFFF"/>
-                      <w:sz w:val="20"/>
+                      <w:sz w:val="19"/>
                     </w:rPr>
                     <w:t>WHO WE ARE</w:t>
                   </w:r>
@@ -157,19 +157,19 @@
           <w:p/>
           <w:p>
             <w:pPr>
-              <w:spacing w:before="0" w:after="40" w:line="259" w:lineRule="auto"/>
+              <w:spacing w:before="0" w:after="20" w:line="252" w:lineRule="auto"/>
             </w:pPr>
           </w:p>
           <w:p>
             <w:pPr>
-              <w:spacing w:before="0" w:after="160" w:line="259" w:lineRule="auto"/>
+              <w:spacing w:before="0" w:after="120" w:line="252" w:lineRule="auto"/>
             </w:pPr>
             <w:r>
               <w:rPr>
                 <w:rFonts w:ascii="Calibri" w:hAnsi="Calibri" w:eastAsia="Calibri"/>
                 <w:b w:val="0"/>
                 <w:color w:val="2A2A2A"/>
-                <w:sz w:val="18"/>
+                <w:sz w:val="17"/>
               </w:rPr>
               <w:t>Axis BIM Solutions is a Warsaw-based BIM practice supporting owners, A/E firms and contractors when geometry, data and documents must stay consistent. We deliver engineering-grade model coordination, construction documents from the model, Scan to BIM for existing assets and BIM process implementation—on-site or remote across the EU.</w:t>
             </w:r>
@@ -189,30 +189,30 @@
               <w:tblLayout w:type="fixed"/>
             </w:tblPr>
             <w:tblGrid>
-              <w:gridCol w:w="5544"/>
+              <w:gridCol w:w="5573"/>
             </w:tblGrid>
             <w:tr>
               <w:tc>
                 <w:tcPr>
-                  <w:tcW w:type="dxa" w:w="5544"/>
+                  <w:tcW w:type="dxa" w:w="5573"/>
                   <w:shd w:fill="001F5C" w:val="clear"/>
                   <w:tcMar>
-                    <w:top w:w="40" w:type="dxa"/>
-                    <w:bottom w:w="40" w:type="dxa"/>
-                    <w:left w:w="80" w:type="dxa"/>
-                    <w:right w:w="80" w:type="dxa"/>
+                    <w:top w:w="30" w:type="dxa"/>
+                    <w:bottom w:w="30" w:type="dxa"/>
+                    <w:left w:w="70" w:type="dxa"/>
+                    <w:right w:w="70" w:type="dxa"/>
                   </w:tcMar>
                 </w:tcPr>
                 <w:p>
                   <w:pPr>
-                    <w:spacing w:before="0" w:after="0" w:line="259" w:lineRule="auto"/>
+                    <w:spacing w:before="0" w:after="0" w:line="252" w:lineRule="auto"/>
                   </w:pPr>
                   <w:r>
                     <w:rPr>
                       <w:rFonts w:ascii="Calibri" w:hAnsi="Calibri" w:eastAsia="Calibri"/>
                       <w:b/>
                       <w:color w:val="FFFFFF"/>
-                      <w:sz w:val="20"/>
+                      <w:sz w:val="19"/>
                     </w:rPr>
                     <w:t>CORE CAPABILITIES</w:t>
                   </w:r>
@@ -223,19 +223,19 @@
           <w:p/>
           <w:p>
             <w:pPr>
-              <w:spacing w:before="0" w:after="40" w:line="259" w:lineRule="auto"/>
+              <w:spacing w:before="0" w:after="20" w:line="252" w:lineRule="auto"/>
             </w:pPr>
           </w:p>
           <w:p>
             <w:pPr>
-              <w:spacing w:before="20" w:after="60" w:line="259" w:lineRule="auto"/>
+              <w:spacing w:before="0" w:after="40" w:line="252" w:lineRule="auto"/>
             </w:pPr>
             <w:r>
               <w:rPr>
                 <w:rFonts w:ascii="Calibri" w:hAnsi="Calibri" w:eastAsia="Calibri"/>
                 <w:b/>
                 <w:color w:val="111111"/>
-                <w:sz w:val="17"/>
+                <w:sz w:val="16"/>
               </w:rPr>
               <w:t xml:space="preserve">Model coordination: </w:t>
             </w:r>
@@ -244,21 +244,21 @@
                 <w:rFonts w:ascii="Calibri" w:hAnsi="Calibri" w:eastAsia="Calibri"/>
                 <w:b w:val="0"/>
                 <w:color w:val="2A2A2A"/>
-                <w:sz w:val="17"/>
+                <w:sz w:val="16"/>
               </w:rPr>
               <w:t>Federate disciplines, run clash detection and keep the shared model under version control through design and construction.</w:t>
             </w:r>
           </w:p>
           <w:p>
             <w:pPr>
-              <w:spacing w:before="20" w:after="60" w:line="259" w:lineRule="auto"/>
+              <w:spacing w:before="0" w:after="40" w:line="252" w:lineRule="auto"/>
             </w:pPr>
             <w:r>
               <w:rPr>
                 <w:rFonts w:ascii="Calibri" w:hAnsi="Calibri" w:eastAsia="Calibri"/>
                 <w:b/>
                 <w:color w:val="111111"/>
-                <w:sz w:val="17"/>
+                <w:sz w:val="16"/>
               </w:rPr>
               <w:t xml:space="preserve">Drawing production: </w:t>
             </w:r>
@@ -267,21 +267,21 @@
                 <w:rFonts w:ascii="Calibri" w:hAnsi="Calibri" w:eastAsia="Calibri"/>
                 <w:b w:val="0"/>
                 <w:color w:val="2A2A2A"/>
-                <w:sz w:val="17"/>
+                <w:sz w:val="16"/>
               </w:rPr>
               <w:t>Extract plans, sections, details and schedules from the model so permit and construction sets stay aligned with the geometry.</w:t>
             </w:r>
           </w:p>
           <w:p>
             <w:pPr>
-              <w:spacing w:before="20" w:after="60" w:line="259" w:lineRule="auto"/>
+              <w:spacing w:before="0" w:after="40" w:line="252" w:lineRule="auto"/>
             </w:pPr>
             <w:r>
               <w:rPr>
                 <w:rFonts w:ascii="Calibri" w:hAnsi="Calibri" w:eastAsia="Calibri"/>
                 <w:b/>
                 <w:color w:val="111111"/>
-                <w:sz w:val="17"/>
+                <w:sz w:val="16"/>
               </w:rPr>
               <w:t xml:space="preserve">Scan to BIM: </w:t>
             </w:r>
@@ -290,21 +290,21 @@
                 <w:rFonts w:ascii="Calibri" w:hAnsi="Calibri" w:eastAsia="Calibri"/>
                 <w:b w:val="0"/>
                 <w:color w:val="2A2A2A"/>
-                <w:sz w:val="17"/>
+                <w:sz w:val="16"/>
               </w:rPr>
               <w:t>Capture existing conditions with point clouds and convert them into accurate as-built models for renovation, fit-out and verification.</w:t>
             </w:r>
           </w:p>
           <w:p>
             <w:pPr>
-              <w:spacing w:before="20" w:after="60" w:line="259" w:lineRule="auto"/>
+              <w:spacing w:before="0" w:after="40" w:line="252" w:lineRule="auto"/>
             </w:pPr>
             <w:r>
               <w:rPr>
                 <w:rFonts w:ascii="Calibri" w:hAnsi="Calibri" w:eastAsia="Calibri"/>
                 <w:b/>
                 <w:color w:val="111111"/>
-                <w:sz w:val="17"/>
+                <w:sz w:val="16"/>
               </w:rPr>
               <w:t xml:space="preserve">BIM implementation: </w:t>
             </w:r>
@@ -313,7 +313,7 @@
                 <w:rFonts w:ascii="Calibri" w:hAnsi="Calibri" w:eastAsia="Calibri"/>
                 <w:b w:val="0"/>
                 <w:color w:val="2A2A2A"/>
-                <w:sz w:val="17"/>
+                <w:sz w:val="16"/>
               </w:rPr>
               <w:t>Define BEP, detail matrices, naming and responsibilities—then coach project teams until the workflow holds without constant oversight.</w:t>
             </w:r>
@@ -334,30 +334,30 @@
               <w:tblLayout w:type="fixed"/>
             </w:tblPr>
             <w:tblGrid>
-              <w:gridCol w:w="5544"/>
+              <w:gridCol w:w="5573"/>
             </w:tblGrid>
             <w:tr>
               <w:tc>
                 <w:tcPr>
-                  <w:tcW w:type="dxa" w:w="5544"/>
+                  <w:tcW w:type="dxa" w:w="5573"/>
                   <w:shd w:fill="001F5C" w:val="clear"/>
                   <w:tcMar>
-                    <w:top w:w="40" w:type="dxa"/>
-                    <w:bottom w:w="40" w:type="dxa"/>
-                    <w:left w:w="80" w:type="dxa"/>
-                    <w:right w:w="80" w:type="dxa"/>
+                    <w:top w:w="30" w:type="dxa"/>
+                    <w:bottom w:w="30" w:type="dxa"/>
+                    <w:left w:w="70" w:type="dxa"/>
+                    <w:right w:w="70" w:type="dxa"/>
                   </w:tcMar>
                 </w:tcPr>
                 <w:p>
                   <w:pPr>
-                    <w:spacing w:before="0" w:after="0" w:line="259" w:lineRule="auto"/>
+                    <w:spacing w:before="0" w:after="0" w:line="252" w:lineRule="auto"/>
                   </w:pPr>
                   <w:r>
                     <w:rPr>
                       <w:rFonts w:ascii="Calibri" w:hAnsi="Calibri" w:eastAsia="Calibri"/>
                       <w:b/>
                       <w:color w:val="FFFFFF"/>
-                      <w:sz w:val="20"/>
+                      <w:sz w:val="19"/>
                     </w:rPr>
                     <w:t>PAST PERFORMANCE</w:t>
                   </w:r>
@@ -368,19 +368,19 @@
           <w:p/>
           <w:p>
             <w:pPr>
-              <w:spacing w:before="0" w:after="40" w:line="259" w:lineRule="auto"/>
+              <w:spacing w:before="0" w:after="20" w:line="252" w:lineRule="auto"/>
             </w:pPr>
           </w:p>
           <w:p>
             <w:pPr>
-              <w:spacing w:before="20" w:after="60" w:line="259" w:lineRule="auto"/>
+              <w:spacing w:before="0" w:after="40" w:line="252" w:lineRule="auto"/>
             </w:pPr>
             <w:r>
               <w:rPr>
                 <w:rFonts w:ascii="Calibri" w:hAnsi="Calibri" w:eastAsia="Calibri"/>
                 <w:b/>
                 <w:color w:val="111111"/>
-                <w:sz w:val="17"/>
+                <w:sz w:val="16"/>
               </w:rPr>
               <w:t xml:space="preserve">Commercial office: </w:t>
             </w:r>
@@ -389,21 +389,21 @@
                 <w:rFonts w:ascii="Calibri" w:hAnsi="Calibri" w:eastAsia="Calibri"/>
                 <w:b w:val="0"/>
                 <w:color w:val="2A2A2A"/>
-                <w:sz w:val="17"/>
+                <w:sz w:val="16"/>
               </w:rPr>
               <w:t>Multidisciplinary federation and weekly clash packages for a dense MEP office fit-out; reduced late design conflicts before CD freeze.</w:t>
             </w:r>
           </w:p>
           <w:p>
             <w:pPr>
-              <w:spacing w:before="20" w:after="60" w:line="259" w:lineRule="auto"/>
+              <w:spacing w:before="0" w:after="40" w:line="252" w:lineRule="auto"/>
             </w:pPr>
             <w:r>
               <w:rPr>
                 <w:rFonts w:ascii="Calibri" w:hAnsi="Calibri" w:eastAsia="Calibri"/>
                 <w:b/>
                 <w:color w:val="111111"/>
-                <w:sz w:val="17"/>
+                <w:sz w:val="16"/>
               </w:rPr>
               <w:t xml:space="preserve">Multifamily housing: </w:t>
             </w:r>
@@ -412,21 +412,21 @@
                 <w:rFonts w:ascii="Calibri" w:hAnsi="Calibri" w:eastAsia="Calibri"/>
                 <w:b w:val="0"/>
                 <w:color w:val="2A2A2A"/>
-                <w:sz w:val="17"/>
+                <w:sz w:val="16"/>
               </w:rPr>
               <w:t>Corridor MEP coordination and repetitive-unit drawing extraction; aligned sheet sets with the live model through CD.</w:t>
             </w:r>
           </w:p>
           <w:p>
             <w:pPr>
-              <w:spacing w:before="20" w:after="60" w:line="259" w:lineRule="auto"/>
+              <w:spacing w:before="0" w:after="40" w:line="252" w:lineRule="auto"/>
             </w:pPr>
             <w:r>
               <w:rPr>
                 <w:rFonts w:ascii="Calibri" w:hAnsi="Calibri" w:eastAsia="Calibri"/>
                 <w:b/>
                 <w:color w:val="111111"/>
-                <w:sz w:val="17"/>
+                <w:sz w:val="16"/>
               </w:rPr>
               <w:t xml:space="preserve">Industrial facility: </w:t>
             </w:r>
@@ -435,21 +435,21 @@
                 <w:rFonts w:ascii="Calibri" w:hAnsi="Calibri" w:eastAsia="Calibri"/>
                 <w:b w:val="0"/>
                 <w:color w:val="2A2A2A"/>
-                <w:sz w:val="17"/>
+                <w:sz w:val="16"/>
               </w:rPr>
               <w:t>Equipment clearance modelling and phased coordination reviews; IFC packages handed to the contractor CDE.</w:t>
             </w:r>
           </w:p>
           <w:p>
             <w:pPr>
-              <w:spacing w:before="20" w:after="60" w:line="259" w:lineRule="auto"/>
+              <w:spacing w:before="0" w:after="40" w:line="252" w:lineRule="auto"/>
             </w:pPr>
             <w:r>
               <w:rPr>
                 <w:rFonts w:ascii="Calibri" w:hAnsi="Calibri" w:eastAsia="Calibri"/>
                 <w:b/>
                 <w:color w:val="111111"/>
-                <w:sz w:val="17"/>
+                <w:sz w:val="16"/>
               </w:rPr>
               <w:t xml:space="preserve">Institutional campus: </w:t>
             </w:r>
@@ -458,7 +458,7 @@
                 <w:rFonts w:ascii="Calibri" w:hAnsi="Calibri" w:eastAsia="Calibri"/>
                 <w:b w:val="0"/>
                 <w:color w:val="2A2A2A"/>
-                <w:sz w:val="17"/>
+                <w:sz w:val="16"/>
               </w:rPr>
               <w:t>Scan to BIM of existing wings plus deviation checks vs design; as-built model used for renovation packages.</w:t>
             </w:r>
@@ -466,353 +466,347 @@
         </w:tc>
         <w:tc>
           <w:tcPr>
-            <w:tcW w:type="dxa" w:w="5544"/>
+            <w:tcW w:type="dxa" w:w="5573"/>
             <w:shd w:fill="FFFFFF" w:val="clear"/>
             <w:tcMar>
-              <w:top w:w="60" w:type="dxa"/>
+              <w:top w:w="40" w:type="dxa"/>
               <w:bottom w:w="40" w:type="dxa"/>
-              <w:left w:w="100" w:type="dxa"/>
-              <w:right w:w="60" w:type="dxa"/>
+              <w:left w:w="90" w:type="dxa"/>
+              <w:right w:w="40" w:type="dxa"/>
             </w:tcMar>
           </w:tcPr>
           <w:p>
             <w:pPr>
-              <w:spacing w:before="0" w:after="120" w:line="259" w:lineRule="auto"/>
+              <w:spacing w:before="0" w:after="80" w:line="252" w:lineRule="auto"/>
             </w:pPr>
             <w:r>
               <w:rPr>
                 <w:rFonts w:ascii="Calibri" w:hAnsi="Calibri" w:eastAsia="Calibri"/>
                 <w:b/>
                 <w:color w:val="001F5C"/>
-                <w:sz w:val="26"/>
+                <w:sz w:val="24"/>
               </w:rPr>
               <w:t>WHY CHOOSE US?</w:t>
             </w:r>
           </w:p>
           <w:p>
             <w:pPr>
-              <w:spacing w:before="40" w:after="20" w:line="259" w:lineRule="auto"/>
+              <w:spacing w:before="20" w:after="0" w:line="252" w:lineRule="auto"/>
             </w:pPr>
             <w:r>
               <w:rPr>
                 <w:rFonts w:ascii="Calibri" w:hAnsi="Calibri" w:eastAsia="Calibri"/>
                 <w:b/>
                 <w:color w:val="001F5C"/>
-                <w:sz w:val="20"/>
+                <w:sz w:val="19"/>
               </w:rPr>
               <w:t>Engineering focus</w:t>
             </w:r>
           </w:p>
           <w:p>
             <w:pPr>
-              <w:spacing w:before="0" w:after="100" w:line="259" w:lineRule="auto"/>
+              <w:spacing w:before="0" w:after="60" w:line="252" w:lineRule="auto"/>
             </w:pPr>
             <w:r>
               <w:rPr>
                 <w:rFonts w:ascii="Calibri" w:hAnsi="Calibri" w:eastAsia="Calibri"/>
                 <w:b w:val="0"/>
                 <w:color w:val="2A2A2A"/>
-                <w:sz w:val="18"/>
+                <w:sz w:val="16"/>
               </w:rPr>
               <w:t>We treat BIM as delivery infrastructure—not visualisation theatre. Models, drawings and CDE rules stay aligned under project pressure.</w:t>
             </w:r>
           </w:p>
           <w:p>
             <w:pPr>
-              <w:spacing w:before="40" w:after="20" w:line="259" w:lineRule="auto"/>
+              <w:spacing w:before="20" w:after="0" w:line="252" w:lineRule="auto"/>
             </w:pPr>
             <w:r>
               <w:rPr>
                 <w:rFonts w:ascii="Calibri" w:hAnsi="Calibri" w:eastAsia="Calibri"/>
                 <w:b/>
                 <w:color w:val="001F5C"/>
-                <w:sz w:val="20"/>
+                <w:sz w:val="19"/>
               </w:rPr>
               <w:t>Federated coordination</w:t>
             </w:r>
           </w:p>
           <w:p>
             <w:pPr>
-              <w:spacing w:before="0" w:after="100" w:line="259" w:lineRule="auto"/>
+              <w:spacing w:before="0" w:after="60" w:line="252" w:lineRule="auto"/>
             </w:pPr>
             <w:r>
               <w:rPr>
                 <w:rFonts w:ascii="Calibri" w:hAnsi="Calibri" w:eastAsia="Calibri"/>
                 <w:b w:val="0"/>
                 <w:color w:val="2A2A2A"/>
-                <w:sz w:val="18"/>
+                <w:sz w:val="16"/>
               </w:rPr>
               <w:t>Discipline overlays, clash detection and issue tracking run as a weekly rhythm so conflicts are closed before documents freeze.</w:t>
             </w:r>
           </w:p>
           <w:p>
             <w:pPr>
-              <w:spacing w:before="40" w:after="20" w:line="259" w:lineRule="auto"/>
+              <w:spacing w:before="20" w:after="0" w:line="252" w:lineRule="auto"/>
             </w:pPr>
             <w:r>
               <w:rPr>
                 <w:rFonts w:ascii="Calibri" w:hAnsi="Calibri" w:eastAsia="Calibri"/>
                 <w:b/>
                 <w:color w:val="001F5C"/>
-                <w:sz w:val="20"/>
+                <w:sz w:val="19"/>
               </w:rPr>
               <w:t>Scan to BIM expertise</w:t>
             </w:r>
           </w:p>
           <w:p>
             <w:pPr>
-              <w:spacing w:before="0" w:after="100" w:line="259" w:lineRule="auto"/>
+              <w:spacing w:before="0" w:after="60" w:line="252" w:lineRule="auto"/>
             </w:pPr>
             <w:r>
               <w:rPr>
                 <w:rFonts w:ascii="Calibri" w:hAnsi="Calibri" w:eastAsia="Calibri"/>
                 <w:b w:val="0"/>
                 <w:color w:val="2A2A2A"/>
-                <w:sz w:val="18"/>
+                <w:sz w:val="16"/>
               </w:rPr>
               <w:t>Point cloud registration and as-built authoring for renovation and verification, with measurable deviation checks vs design.</w:t>
             </w:r>
           </w:p>
           <w:p>
             <w:pPr>
-              <w:spacing w:before="40" w:after="20" w:line="259" w:lineRule="auto"/>
+              <w:spacing w:before="20" w:after="0" w:line="252" w:lineRule="auto"/>
             </w:pPr>
             <w:r>
               <w:rPr>
                 <w:rFonts w:ascii="Calibri" w:hAnsi="Calibri" w:eastAsia="Calibri"/>
                 <w:b/>
                 <w:color w:val="001F5C"/>
-                <w:sz w:val="20"/>
+                <w:sz w:val="19"/>
               </w:rPr>
               <w:t>Process that sticks</w:t>
             </w:r>
           </w:p>
           <w:p>
             <w:pPr>
-              <w:spacing w:before="0" w:after="100" w:line="259" w:lineRule="auto"/>
+              <w:spacing w:before="0" w:after="60" w:line="252" w:lineRule="auto"/>
             </w:pPr>
             <w:r>
               <w:rPr>
                 <w:rFonts w:ascii="Calibri" w:hAnsi="Calibri" w:eastAsia="Calibri"/>
                 <w:b w:val="0"/>
                 <w:color w:val="2A2A2A"/>
-                <w:sz w:val="18"/>
+                <w:sz w:val="16"/>
               </w:rPr>
               <w:t>BEP, naming, RACI and pilot coaching so teams keep the workflow after handoff—not only during our engagement.</w:t>
             </w:r>
           </w:p>
           <w:p>
             <w:pPr>
-              <w:spacing w:before="40" w:after="20" w:line="259" w:lineRule="auto"/>
+              <w:spacing w:before="20" w:after="0" w:line="252" w:lineRule="auto"/>
             </w:pPr>
             <w:r>
               <w:rPr>
                 <w:rFonts w:ascii="Calibri" w:hAnsi="Calibri" w:eastAsia="Calibri"/>
                 <w:b/>
                 <w:color w:val="001F5C"/>
-                <w:sz w:val="20"/>
+                <w:sz w:val="19"/>
               </w:rPr>
               <w:t>EU delivery</w:t>
             </w:r>
           </w:p>
           <w:p>
             <w:pPr>
-              <w:spacing w:before="0" w:after="100" w:line="259" w:lineRule="auto"/>
+              <w:spacing w:before="0" w:after="60" w:line="252" w:lineRule="auto"/>
             </w:pPr>
             <w:r>
               <w:rPr>
                 <w:rFonts w:ascii="Calibri" w:hAnsi="Calibri" w:eastAsia="Calibri"/>
                 <w:b w:val="0"/>
                 <w:color w:val="2A2A2A"/>
-                <w:sz w:val="18"/>
+                <w:sz w:val="16"/>
               </w:rPr>
               <w:t>Warsaw-based, available on-site or remote across the EU for owners, A/E firms and contractors.</w:t>
             </w:r>
           </w:p>
           <w:p>
             <w:pPr>
-              <w:spacing w:before="120" w:after="80" w:line="259" w:lineRule="auto"/>
+              <w:spacing w:before="80" w:after="60" w:line="252" w:lineRule="auto"/>
             </w:pPr>
             <w:r>
               <w:rPr>
                 <w:rFonts w:ascii="Calibri" w:hAnsi="Calibri" w:eastAsia="Calibri"/>
                 <w:b/>
                 <w:color w:val="001F5C"/>
-                <w:sz w:val="26"/>
+                <w:sz w:val="24"/>
               </w:rPr>
               <w:t>OUR DIFFERENTIATORS</w:t>
             </w:r>
           </w:p>
           <w:p>
             <w:pPr>
-              <w:pStyle w:val="ListBullet"/>
-              <w:spacing w:before="0" w:after="40" w:line="259" w:lineRule="auto"/>
+              <w:spacing w:before="0" w:after="20" w:line="252" w:lineRule="auto"/>
             </w:pPr>
             <w:r>
               <w:rPr>
                 <w:rFonts w:ascii="Calibri" w:hAnsi="Calibri" w:eastAsia="Calibri"/>
                 <w:b w:val="0"/>
                 <w:color w:val="2A2A2A"/>
-                <w:sz w:val="18"/>
+                <w:sz w:val="16"/>
               </w:rPr>
-              <w:t>Model-first drawing production (plans, sections, schedules from the federated model)</w:t>
+              <w:t>•  Model-first drawing production (plans, sections, schedules from the federated model)</w:t>
             </w:r>
           </w:p>
           <w:p>
             <w:pPr>
-              <w:pStyle w:val="ListBullet"/>
-              <w:spacing w:before="0" w:after="40" w:line="259" w:lineRule="auto"/>
+              <w:spacing w:before="0" w:after="20" w:line="252" w:lineRule="auto"/>
             </w:pPr>
             <w:r>
               <w:rPr>
                 <w:rFonts w:ascii="Calibri" w:hAnsi="Calibri" w:eastAsia="Calibri"/>
                 <w:b w:val="0"/>
                 <w:color w:val="2A2A2A"/>
-                <w:sz w:val="18"/>
+                <w:sz w:val="16"/>
               </w:rPr>
-              <w:t>Clash detection tied to clear tolerances and coordination packages</w:t>
+              <w:t>•  Clash detection tied to clear tolerances and coordination packages</w:t>
             </w:r>
           </w:p>
           <w:p>
             <w:pPr>
-              <w:pStyle w:val="ListBullet"/>
-              <w:spacing w:before="0" w:after="40" w:line="259" w:lineRule="auto"/>
+              <w:spacing w:before="0" w:after="20" w:line="252" w:lineRule="auto"/>
             </w:pPr>
             <w:r>
               <w:rPr>
                 <w:rFonts w:ascii="Calibri" w:hAnsi="Calibri" w:eastAsia="Calibri"/>
                 <w:b w:val="0"/>
                 <w:color w:val="2A2A2A"/>
-                <w:sz w:val="18"/>
+                <w:sz w:val="16"/>
               </w:rPr>
-              <w:t>Scan to BIM for existing assets and renovation verification</w:t>
+              <w:t>•  Scan to BIM for existing assets and renovation verification</w:t>
             </w:r>
           </w:p>
           <w:p>
             <w:pPr>
-              <w:pStyle w:val="ListBullet"/>
-              <w:spacing w:before="0" w:after="40" w:line="259" w:lineRule="auto"/>
+              <w:spacing w:before="0" w:after="20" w:line="252" w:lineRule="auto"/>
             </w:pPr>
             <w:r>
               <w:rPr>
                 <w:rFonts w:ascii="Calibri" w:hAnsi="Calibri" w:eastAsia="Calibri"/>
                 <w:b w:val="0"/>
                 <w:color w:val="2A2A2A"/>
-                <w:sz w:val="18"/>
+                <w:sz w:val="16"/>
               </w:rPr>
-              <w:t>Authoring in Revit · AutoCAD · Tekla; coordination in Navisworks · Solibri</w:t>
+              <w:t>•  Authoring in Revit · AutoCAD · Tekla; coordination in Navisworks · Solibri</w:t>
             </w:r>
           </w:p>
           <w:p>
             <w:pPr>
-              <w:pStyle w:val="ListBullet"/>
-              <w:spacing w:before="0" w:after="40" w:line="259" w:lineRule="auto"/>
+              <w:spacing w:before="0" w:after="20" w:line="252" w:lineRule="auto"/>
             </w:pPr>
             <w:r>
               <w:rPr>
                 <w:rFonts w:ascii="Calibri" w:hAnsi="Calibri" w:eastAsia="Calibri"/>
                 <w:b w:val="0"/>
                 <w:color w:val="2A2A2A"/>
-                <w:sz w:val="18"/>
+                <w:sz w:val="16"/>
               </w:rPr>
-              <w:t>CDE setup on Autodesk Construction Cloud / BIM 360</w:t>
+              <w:t>•  CDE setup on Autodesk Construction Cloud / BIM 360</w:t>
             </w:r>
           </w:p>
           <w:p>
             <w:pPr>
-              <w:pStyle w:val="ListBullet"/>
-              <w:spacing w:before="0" w:after="40" w:line="259" w:lineRule="auto"/>
+              <w:spacing w:before="0" w:after="20" w:line="252" w:lineRule="auto"/>
             </w:pPr>
             <w:r>
               <w:rPr>
                 <w:rFonts w:ascii="Calibri" w:hAnsi="Calibri" w:eastAsia="Calibri"/>
                 <w:b w:val="0"/>
                 <w:color w:val="2A2A2A"/>
-                <w:sz w:val="18"/>
+                <w:sz w:val="16"/>
               </w:rPr>
-              <w:t>Detail-level alignment, IFC exchange and as-built updates</w:t>
+              <w:t>•  Detail-level alignment, IFC exchange and as-built updates</w:t>
             </w:r>
           </w:p>
           <w:p>
             <w:pPr>
-              <w:spacing w:before="160" w:after="80" w:line="259" w:lineRule="auto"/>
+              <w:spacing w:before="100" w:after="60" w:line="252" w:lineRule="auto"/>
             </w:pPr>
             <w:r>
               <w:rPr>
                 <w:rFonts w:ascii="Calibri" w:hAnsi="Calibri" w:eastAsia="Calibri"/>
                 <w:b/>
                 <w:color w:val="001F5C"/>
-                <w:sz w:val="26"/>
+                <w:sz w:val="24"/>
               </w:rPr>
               <w:t>CERTIFICATIONS &amp; PLATFORM</w:t>
             </w:r>
           </w:p>
           <w:p>
             <w:pPr>
-              <w:spacing w:before="0" w:after="40" w:line="259" w:lineRule="auto"/>
+              <w:spacing w:before="0" w:after="20" w:line="252" w:lineRule="auto"/>
             </w:pPr>
             <w:r>
               <w:rPr>
                 <w:rFonts w:ascii="Calibri" w:hAnsi="Calibri" w:eastAsia="Calibri"/>
                 <w:b w:val="0"/>
                 <w:color w:val="2A2A2A"/>
-                <w:sz w:val="18"/>
+                <w:sz w:val="16"/>
               </w:rPr>
               <w:t>•  Authoring: Revit · AutoCAD · Tekla</w:t>
             </w:r>
           </w:p>
           <w:p>
             <w:pPr>
-              <w:spacing w:before="0" w:after="40" w:line="259" w:lineRule="auto"/>
+              <w:spacing w:before="0" w:after="20" w:line="252" w:lineRule="auto"/>
             </w:pPr>
             <w:r>
               <w:rPr>
                 <w:rFonts w:ascii="Calibri" w:hAnsi="Calibri" w:eastAsia="Calibri"/>
                 <w:b w:val="0"/>
                 <w:color w:val="2A2A2A"/>
-                <w:sz w:val="18"/>
+                <w:sz w:val="16"/>
               </w:rPr>
               <w:t>•  Coordination: Navisworks · Solibri</w:t>
             </w:r>
           </w:p>
           <w:p>
             <w:pPr>
-              <w:spacing w:before="0" w:after="40" w:line="259" w:lineRule="auto"/>
+              <w:spacing w:before="0" w:after="20" w:line="252" w:lineRule="auto"/>
             </w:pPr>
             <w:r>
               <w:rPr>
                 <w:rFonts w:ascii="Calibri" w:hAnsi="Calibri" w:eastAsia="Calibri"/>
                 <w:b w:val="0"/>
                 <w:color w:val="2A2A2A"/>
-                <w:sz w:val="18"/>
+                <w:sz w:val="16"/>
               </w:rPr>
               <w:t>•  CDE: Autodesk Construction Cloud / BIM 360</w:t>
             </w:r>
           </w:p>
           <w:p>
             <w:pPr>
-              <w:spacing w:before="0" w:after="40" w:line="259" w:lineRule="auto"/>
+              <w:spacing w:before="0" w:after="20" w:line="252" w:lineRule="auto"/>
             </w:pPr>
             <w:r>
               <w:rPr>
                 <w:rFonts w:ascii="Calibri" w:hAnsi="Calibri" w:eastAsia="Calibri"/>
                 <w:b w:val="0"/>
                 <w:color w:val="2A2A2A"/>
-                <w:sz w:val="18"/>
+                <w:sz w:val="16"/>
               </w:rPr>
               <w:t>•  Exchange: IFC and project-specific deliverable packages</w:t>
             </w:r>
           </w:p>
           <w:p>
             <w:pPr>
-              <w:spacing w:before="0" w:after="40" w:line="259" w:lineRule="auto"/>
+              <w:spacing w:before="0" w:after="20" w:line="252" w:lineRule="auto"/>
             </w:pPr>
             <w:r>
               <w:rPr>
                 <w:rFonts w:ascii="Calibri" w:hAnsi="Calibri" w:eastAsia="Calibri"/>
                 <w:b w:val="0"/>
                 <w:color w:val="2A2A2A"/>
-                <w:sz w:val="18"/>
+                <w:sz w:val="16"/>
               </w:rPr>
               <w:t>•  Sectors: Commercial · Multifamily · Industrial · Institutional</w:t>
             </w:r>
@@ -822,7 +816,7 @@
     </w:tbl>
     <w:p>
       <w:pPr>
-        <w:spacing w:before="120" w:after="0" w:line="259" w:lineRule="auto"/>
+        <w:spacing w:before="80" w:after="0" w:line="252" w:lineRule="auto"/>
       </w:pPr>
     </w:p>
     <w:tbl>
@@ -840,29 +834,134 @@
         <w:tblLayout w:type="fixed"/>
       </w:tblPr>
       <w:tblGrid>
-        <w:gridCol w:w="2160"/>
-        <w:gridCol w:w="8928"/>
+        <w:gridCol w:w="8208"/>
+        <w:gridCol w:w="2938"/>
       </w:tblGrid>
       <w:tr>
         <w:tc>
           <w:tcPr>
-            <w:tcW w:type="dxa" w:w="5544"/>
+            <w:tcW w:type="dxa" w:w="5573"/>
             <w:shd w:fill="001F5C" w:val="clear"/>
             <w:tcMar>
-              <w:top w:w="80" w:type="dxa"/>
-              <w:bottom w:w="80" w:type="dxa"/>
+              <w:top w:w="70" w:type="dxa"/>
+              <w:bottom w:w="70" w:type="dxa"/>
               <w:left w:w="80" w:type="dxa"/>
               <w:right w:w="40" w:type="dxa"/>
             </w:tcMar>
           </w:tcPr>
           <w:p>
             <w:pPr>
-              <w:spacing w:before="0" w:after="0" w:line="259" w:lineRule="auto"/>
+              <w:spacing w:before="0" w:after="20" w:line="252" w:lineRule="auto"/>
+            </w:pPr>
+            <w:r>
+              <w:rPr>
+                <w:rFonts w:ascii="Calibri" w:hAnsi="Calibri" w:eastAsia="Calibri"/>
+                <w:b/>
+                <w:color w:val="FFFFFF"/>
+                <w:sz w:val="17"/>
+              </w:rPr>
+              <w:t xml:space="preserve">Phone: </w:t>
+            </w:r>
+            <w:r>
+              <w:rPr>
+                <w:rFonts w:ascii="Calibri" w:hAnsi="Calibri" w:eastAsia="Calibri"/>
+                <w:b w:val="0"/>
+                <w:color w:val="E0E8F2"/>
+                <w:sz w:val="17"/>
+              </w:rPr>
+              <w:t>+48 22 555 01 48</w:t>
+            </w:r>
+          </w:p>
+          <w:p>
+            <w:pPr>
+              <w:spacing w:before="0" w:after="20" w:line="252" w:lineRule="auto"/>
+            </w:pPr>
+            <w:r>
+              <w:rPr>
+                <w:rFonts w:ascii="Calibri" w:hAnsi="Calibri" w:eastAsia="Calibri"/>
+                <w:b/>
+                <w:color w:val="FFFFFF"/>
+                <w:sz w:val="17"/>
+              </w:rPr>
+              <w:t xml:space="preserve">Email: </w:t>
+            </w:r>
+            <w:r>
+              <w:rPr>
+                <w:rFonts w:ascii="Calibri" w:hAnsi="Calibri" w:eastAsia="Calibri"/>
+                <w:b w:val="0"/>
+                <w:color w:val="E0E8F2"/>
+                <w:sz w:val="17"/>
+              </w:rPr>
+              <w:t>hello@axisbim.com</w:t>
+            </w:r>
+          </w:p>
+          <w:p>
+            <w:pPr>
+              <w:spacing w:before="0" w:after="20" w:line="252" w:lineRule="auto"/>
+            </w:pPr>
+            <w:r>
+              <w:rPr>
+                <w:rFonts w:ascii="Calibri" w:hAnsi="Calibri" w:eastAsia="Calibri"/>
+                <w:b/>
+                <w:color w:val="FFFFFF"/>
+                <w:sz w:val="17"/>
+              </w:rPr>
+              <w:t xml:space="preserve">Website: </w:t>
+            </w:r>
+            <w:r>
+              <w:rPr>
+                <w:rFonts w:ascii="Calibri" w:hAnsi="Calibri" w:eastAsia="Calibri"/>
+                <w:b w:val="0"/>
+                <w:color w:val="E0E8F2"/>
+                <w:sz w:val="17"/>
+              </w:rPr>
+              <w:t>axisbim.com</w:t>
+            </w:r>
+          </w:p>
+          <w:p>
+            <w:pPr>
+              <w:spacing w:before="0" w:after="20" w:line="252" w:lineRule="auto"/>
+            </w:pPr>
+            <w:r>
+              <w:rPr>
+                <w:rFonts w:ascii="Calibri" w:hAnsi="Calibri" w:eastAsia="Calibri"/>
+                <w:b/>
+                <w:color w:val="FFFFFF"/>
+                <w:sz w:val="17"/>
+              </w:rPr>
+              <w:t xml:space="preserve">Address: </w:t>
+            </w:r>
+            <w:r>
+              <w:rPr>
+                <w:rFonts w:ascii="Calibri" w:hAnsi="Calibri" w:eastAsia="Calibri"/>
+                <w:b w:val="0"/>
+                <w:color w:val="E0E8F2"/>
+                <w:sz w:val="17"/>
+              </w:rPr>
+              <w:t>Warsaw, Poland · EU remote</w:t>
+            </w:r>
+          </w:p>
+        </w:tc>
+        <w:tc>
+          <w:tcPr>
+            <w:tcW w:type="dxa" w:w="5573"/>
+            <w:shd w:fill="001F5C" w:val="clear"/>
+            <w:tcMar>
+              <w:top w:w="50" w:type="dxa"/>
+              <w:bottom w:w="50" w:type="dxa"/>
+              <w:left w:w="40" w:type="dxa"/>
+              <w:right w:w="60" w:type="dxa"/>
+            </w:tcMar>
+          </w:tcPr>
+          <w:p>
+            <w:pPr>
+              <w:spacing w:before="0" w:after="40" w:line="252" w:lineRule="auto"/>
+              <w:jc w:val="right"/>
             </w:pPr>
             <w:r>
               <w:drawing>
                 <wp:inline xmlns:a="http://schemas.openxmlformats.org/drawingml/2006/main" xmlns:pic="http://schemas.openxmlformats.org/drawingml/2006/picture">
-                  <wp:extent cx="868680" cy="868680"/>
+                  <wp:extent cx="713232" cy="713232"/>
                   <wp:docPr id="2" name="Picture 2"/>
                   <wp:cNvGraphicFramePr>
                     <a:graphicFrameLocks noChangeAspect="1"/>
@@ -883,7 +982,7 @@
                         <pic:spPr>
                           <a:xfrm>
                             <a:off x="0" y="0"/>
-                            <a:ext cx="868680" cy="868680"/>
+                            <a:ext cx="713232" cy="713232"/>
                           </a:xfrm>
                           <a:prstGeom prst="rect"/>
                         </pic:spPr>
@@ -894,108 +993,21 @@
               </w:drawing>
             </w:r>
           </w:p>
-        </w:tc>
-        <w:tc>
-          <w:tcPr>
-            <w:tcW w:type="dxa" w:w="5544"/>
-            <w:shd w:fill="001F5C" w:val="clear"/>
-            <w:tcMar>
-              <w:top w:w="70" w:type="dxa"/>
-              <w:bottom w:w="70" w:type="dxa"/>
-              <w:left w:w="40" w:type="dxa"/>
-              <w:right w:w="80" w:type="dxa"/>
-            </w:tcMar>
-          </w:tcPr>
           <w:p>
             <w:pPr>
-              <w:spacing w:before="0" w:after="40" w:line="259" w:lineRule="auto"/>
+              <w:spacing w:before="0" w:after="0" w:line="252" w:lineRule="auto"/>
+              <w:jc w:val="right"/>
             </w:pPr>
-            <w:r>
-              <w:rPr>
-                <w:rFonts w:ascii="Calibri" w:hAnsi="Calibri" w:eastAsia="Calibri"/>
-                <w:b/>
-                <w:color w:val="FFFFFF"/>
-                <w:sz w:val="18"/>
-              </w:rPr>
-              <w:t xml:space="preserve">Phone: </w:t>
-            </w:r>
             <w:r>
               <w:rPr>
                 <w:rFonts w:ascii="Calibri" w:hAnsi="Calibri" w:eastAsia="Calibri"/>
                 <w:b w:val="0"/>
                 <w:color w:val="E0E8F2"/>
-                <w:sz w:val="18"/>
+                <w:sz w:val="15"/>
               </w:rPr>
-              <w:t>+48 22 555 01 48</w:t>
-            </w:r>
-          </w:p>
-          <w:p>
-            <w:pPr>
-              <w:spacing w:before="0" w:after="40" w:line="259" w:lineRule="auto"/>
-            </w:pPr>
-            <w:r>
-              <w:rPr>
-                <w:rFonts w:ascii="Calibri" w:hAnsi="Calibri" w:eastAsia="Calibri"/>
-                <w:b/>
-                <w:color w:val="FFFFFF"/>
-                <w:sz w:val="18"/>
-              </w:rPr>
-              <w:t xml:space="preserve">Email: </w:t>
-            </w:r>
-            <w:r>
-              <w:rPr>
-                <w:rFonts w:ascii="Calibri" w:hAnsi="Calibri" w:eastAsia="Calibri"/>
-                <w:b w:val="0"/>
-                <w:color w:val="E0E8F2"/>
-                <w:sz w:val="18"/>
-              </w:rPr>
-              <w:t>hello@axisbim.com</w:t>
-            </w:r>
-          </w:p>
-          <w:p>
-            <w:pPr>
-              <w:spacing w:before="0" w:after="40" w:line="259" w:lineRule="auto"/>
-            </w:pPr>
-            <w:r>
-              <w:rPr>
-                <w:rFonts w:ascii="Calibri" w:hAnsi="Calibri" w:eastAsia="Calibri"/>
-                <w:b/>
-                <w:color w:val="FFFFFF"/>
-                <w:sz w:val="18"/>
-              </w:rPr>
-              <w:t xml:space="preserve">Website: </w:t>
-            </w:r>
-            <w:r>
-              <w:rPr>
-                <w:rFonts w:ascii="Calibri" w:hAnsi="Calibri" w:eastAsia="Calibri"/>
-                <w:b w:val="0"/>
-                <w:color w:val="E0E8F2"/>
-                <w:sz w:val="18"/>
-              </w:rPr>
-              <w:t>axisbim.com</w:t>
-            </w:r>
-          </w:p>
-          <w:p>
-            <w:pPr>
-              <w:spacing w:before="0" w:after="40" w:line="259" w:lineRule="auto"/>
-            </w:pPr>
-            <w:r>
-              <w:rPr>
-                <w:rFonts w:ascii="Calibri" w:hAnsi="Calibri" w:eastAsia="Calibri"/>
-                <w:b/>
-                <w:color w:val="FFFFFF"/>
-                <w:sz w:val="18"/>
-              </w:rPr>
-              <w:t xml:space="preserve">Address: </w:t>
-            </w:r>
-            <w:r>
-              <w:rPr>
-                <w:rFonts w:ascii="Calibri" w:hAnsi="Calibri" w:eastAsia="Calibri"/>
-                <w:b w:val="0"/>
-                <w:color w:val="E0E8F2"/>
-                <w:sz w:val="18"/>
-              </w:rPr>
-              <w:t>Warsaw, Poland · EU remote</w:t>
+              <w:t>Scan for the website</w:t>
+              <w:br/>
+              <w:t>axisbimsolutions.com</w:t>
             </w:r>
           </w:p>
         </w:tc>
@@ -1003,7 +1015,7 @@
     </w:tbl>
     <w:sectPr>
       <w:pgSz w:w="12240" w:h="15840"/>
-      <w:pgMar w:top="432" w:right="576" w:bottom="432" w:left="576" w:header="720" w:footer="720" w:gutter="0"/>
+      <w:pgMar w:top="403" w:right="547" w:bottom="403" w:left="547" w:header="720" w:footer="720" w:gutter="0"/>
       <w:cols w:space="720"/>
       <w:docGrid w:linePitch="360"/>
     </w:sectPr>

</xml_diff>